<commit_message>
test(sandbox): add the missing Lastra reference to the Cano Martinez sample
</commit_message>
<xml_diff>
--- a/sandbox/pack_2/inputs/01_IMRyD_Cano_Martinez.docx
+++ b/sandbox/pack_2/inputs/01_IMRyD_Cano_Martinez.docx
@@ -185,7 +185,13 @@
         <w:jc w:val="both"/>
       </w:pPr>
       <w:r>
-        <w:t>Para entender el mundo digital y tecnológicamente modificado, es necesario reconocer el aumento de la densidad digital en el mundo físico, el incremento de los flujos de información desde los objetos conectados y, especialmente, el cambio en las dinámicas humanas, por el cual las personas privilegian los contactos y relaciones desde dispositivos, particularmente móviles, para sus actividades diarias y potenciar sus posibilidades y oportunidades (McKinsey &amp; Company, 2021).</w:t>
+        <w:t xml:space="preserve">Para entender el mundo digital y tecnológicamente modificado, es necesario reconocer el aumento de la densidad digital en el mundo físico, el incremento de los flujos de información desde los objetos conectados y, especialmente, el cambio en las dinámicas humanas, por el cual las personas privilegian los contactos y relaciones desde dispositivos, particularmente móviles, para sus actividades diarias y potenciar sus posibilidades y oportunidades (McKinsey </w:t>
+      </w:r>
+      <w:r>
+        <w:t>y</w:t>
+      </w:r>
+      <w:r>
+        <w:t xml:space="preserve"> Company, 2021).</w:t>
       </w:r>
     </w:p>
     <w:p>
@@ -236,7 +242,13 @@
       </w:r>
       <w:r>
         <w:lastRenderedPageBreak/>
-        <w:t>disruptivas, que exigen cada vez experiencias distintas que respondan a sus altas expectativas (Hines &amp; Bishop, 2015).</w:t>
+        <w:t xml:space="preserve">disruptivas, que exigen cada vez experiencias distintas que respondan a sus altas expectativas (Hines </w:t>
+      </w:r>
+      <w:r>
+        <w:t>y</w:t>
+      </w:r>
+      <w:r>
+        <w:t xml:space="preserve"> Bishop, 2015).</w:t>
       </w:r>
     </w:p>
     <w:p>
@@ -442,12 +454,6 @@
         <w:gridCol w:w="4680"/>
       </w:tblGrid>
       <w:tr>
-        <w:tblPrEx>
-          <w:tblCellMar>
-            <w:top w:w="0" w:type="dxa"/>
-            <w:bottom w:w="0" w:type="dxa"/>
-          </w:tblCellMar>
-        </w:tblPrEx>
         <w:tc>
           <w:tcPr>
             <w:tcW w:w="4680" w:type="dxa"/>
@@ -478,12 +484,6 @@
         </w:tc>
       </w:tr>
       <w:tr>
-        <w:tblPrEx>
-          <w:tblCellMar>
-            <w:top w:w="0" w:type="dxa"/>
-            <w:bottom w:w="0" w:type="dxa"/>
-          </w:tblCellMar>
-        </w:tblPrEx>
         <w:tc>
           <w:tcPr>
             <w:tcW w:w="4680" w:type="dxa"/>
@@ -530,12 +530,6 @@
         </w:tc>
       </w:tr>
       <w:tr>
-        <w:tblPrEx>
-          <w:tblCellMar>
-            <w:top w:w="0" w:type="dxa"/>
-            <w:bottom w:w="0" w:type="dxa"/>
-          </w:tblCellMar>
-        </w:tblPrEx>
         <w:tc>
           <w:tcPr>
             <w:tcW w:w="4680" w:type="dxa"/>
@@ -582,12 +576,6 @@
         </w:tc>
       </w:tr>
       <w:tr>
-        <w:tblPrEx>
-          <w:tblCellMar>
-            <w:top w:w="0" w:type="dxa"/>
-            <w:bottom w:w="0" w:type="dxa"/>
-          </w:tblCellMar>
-        </w:tblPrEx>
         <w:tc>
           <w:tcPr>
             <w:tcW w:w="4680" w:type="dxa"/>
@@ -634,12 +622,6 @@
         </w:tc>
       </w:tr>
       <w:tr>
-        <w:tblPrEx>
-          <w:tblCellMar>
-            <w:top w:w="0" w:type="dxa"/>
-            <w:bottom w:w="0" w:type="dxa"/>
-          </w:tblCellMar>
-        </w:tblPrEx>
         <w:tc>
           <w:tcPr>
             <w:tcW w:w="4680" w:type="dxa"/>
@@ -687,12 +669,6 @@
         </w:tc>
       </w:tr>
       <w:tr>
-        <w:tblPrEx>
-          <w:tblCellMar>
-            <w:top w:w="0" w:type="dxa"/>
-            <w:bottom w:w="0" w:type="dxa"/>
-          </w:tblCellMar>
-        </w:tblPrEx>
         <w:tc>
           <w:tcPr>
             <w:tcW w:w="4680" w:type="dxa"/>
@@ -739,12 +715,6 @@
         </w:tc>
       </w:tr>
       <w:tr>
-        <w:tblPrEx>
-          <w:tblCellMar>
-            <w:top w:w="0" w:type="dxa"/>
-            <w:bottom w:w="0" w:type="dxa"/>
-          </w:tblCellMar>
-        </w:tblPrEx>
         <w:tc>
           <w:tcPr>
             <w:tcW w:w="4680" w:type="dxa"/>
@@ -1010,7 +980,13 @@
         <w:jc w:val="both"/>
       </w:pPr>
       <w:r>
-        <w:t>En la actualidad, el ciberespacio configura un escenario extendido de las dinámicas sociales y económicas de una nación. En este sentido, habilitar elementos de confianza digital y nuevas oportunidades de negocio permite movilizar no solamente conexiones, sino diferentes alternativas y el desarrollo de capacidades que pueden llevar al posicionamiento de industrias e iniciativas donde se crean nuevas experiencias y surgen nuevas propuestas de valor (Hepfer &amp; Powell, 2020).</w:t>
+        <w:t xml:space="preserve">En la actualidad, el ciberespacio configura un escenario extendido de las dinámicas sociales y económicas de una nación. En este sentido, habilitar elementos de confianza digital y nuevas oportunidades de negocio permite movilizar no solamente conexiones, sino diferentes alternativas y el desarrollo de capacidades que pueden llevar al posicionamiento de industrias e iniciativas donde se crean nuevas experiencias y surgen nuevas propuestas de valor (Hepfer </w:t>
+      </w:r>
+      <w:r>
+        <w:t>y</w:t>
+      </w:r>
+      <w:r>
+        <w:t xml:space="preserve"> Powell, 2020).</w:t>
       </w:r>
     </w:p>
     <w:p>
@@ -1122,7 +1098,13 @@
       </w:r>
       <w:proofErr w:type="spellEnd"/>
       <w:r>
-        <w:t>, esto es, acciones cibernéticas generalmente desarrolladas por debajo del umbral del uso de la fuerza, configuran las mejores estrategias ofensivas, ya que pueden pasar desapercibidas, o ser ignoradas y negadas si llegan a ser descubiertas (</w:t>
+        <w:t>, esto es, acciones cibernéticas generalmente desarrolladas por debajo del umbral del uso de la fuerza, configuran las mejores estrategias ofensivas</w:t>
+      </w:r>
+      <w:r>
+        <w:t xml:space="preserve"> y</w:t>
+      </w:r>
+      <w:r>
+        <w:t>a que pueden pasar desapercibidas, o ser ignoradas y negadas si llegan a ser descubiertas (</w:t>
       </w:r>
       <w:proofErr w:type="spellStart"/>
       <w:r>
@@ -1402,7 +1384,13 @@
         <w:jc w:val="both"/>
       </w:pPr>
       <w:r>
-        <w:t>Impacto: Las infraestructuras críticas cibernéticas han venido siendo blanco de operaciones ofensivas en el ciberespacio. El uso de algoritmos de aprendizaje profundo con el fin de engañar los mecanismos de defensa disponibles pone en evidencia las nuevas capacidades de los adversarios para profundizar sus estrategias de engaño y manipulación más allá de las vulnerabilidades conocidas hasta hace poco (Raban &amp; Hauptman, 2018).</w:t>
+        <w:t xml:space="preserve">Impacto: Las infraestructuras críticas cibernéticas han venido siendo blanco de operaciones ofensivas en el ciberespacio. El uso de algoritmos de aprendizaje profundo con el fin de engañar los mecanismos de defensa disponibles pone en evidencia las nuevas capacidades de los adversarios para profundizar sus estrategias de engaño y manipulación más allá de las vulnerabilidades conocidas hasta hace poco (Raban </w:t>
+      </w:r>
+      <w:r>
+        <w:t>y</w:t>
+      </w:r>
+      <w:r>
+        <w:t xml:space="preserve"> Hauptman, 2018).</w:t>
       </w:r>
     </w:p>
     <w:p>
@@ -1456,7 +1444,13 @@
         <w:jc w:val="both"/>
       </w:pPr>
       <w:r>
-        <w:t>Evidencia: Existe inteligencia artificial adversarial, generación de redes adversariales, desarrollo de robots con inteligencia artificial autónoma. Estos elementos se evidencian en una visión prospectiva con el fin de mantenerlos en monitoreo, ya que actualmente despuntan a nivel internacional y poco a poco estarán disponibles no solo para los países en desarrollo, sino igualmente para los adversarios (Riquelme, 2020).</w:t>
+        <w:t>Evidencia: Existe inteligencia artificial adversarial, generación de redes adversariales, desarrollo de robots con inteligencia artificial autónoma. Estos elementos se evidencian en una visión prospectiva con el fin de mantenerlos en monitoreo</w:t>
+      </w:r>
+      <w:r>
+        <w:t xml:space="preserve"> y</w:t>
+      </w:r>
+      <w:r>
+        <w:t>a que actualmente despuntan a nivel internacional y poco a poco estarán disponibles no solo para los países en desarrollo, sino igualmente para los adversarios (Riquelme, 2020).</w:t>
       </w:r>
     </w:p>
     <w:p>
@@ -1479,7 +1473,13 @@
         <w:jc w:val="both"/>
       </w:pPr>
       <w:r>
-        <w:t>A nivel internacional se ha venido insistiendo en los impactos concretos que se tienen sobre el cambio climático. La tecnología no ha sido ajena a esta dinámica, de modo que se han revisado las políticas de adquisición de nuevos componentes tecnológicos y de proveedores de servicios en la nube, y se ha ampliado la conciencia frente a su huella de carbono. Si bien esto aún no se concibe como una política concreta en las organizaciones, comienza a despuntar en la medida que crece la presión internacional sobre el tema. En consecuencia, las organizaciones y naciones tendrán que mantener y desarrollar una perspectiva ecológica que conecte sus retos propios de la transformación digital con el desafío de mitigar sus aportes a la emisión de gases de efecto invernadero (Soler, 2019).</w:t>
+        <w:t>A nivel internacional se ha venido insistiendo en los impactos concretos que se tienen sobre el cambio climático. La tecnología no ha sido ajena a esta dinámica, de modo que se han revisado las políticas de adquisición de nuevos componentes tecnológicos y de proveedores de servicios en la nube</w:t>
+      </w:r>
+      <w:r>
+        <w:t xml:space="preserve"> y</w:t>
+      </w:r>
+      <w:r>
+        <w:t xml:space="preserve"> se ha ampliado la conciencia frente a su huella de carbono. Si bien esto aún no se concibe como una política concreta en las organizaciones, comienza a despuntar en la medida que crece la presión internacional sobre el tema. En consecuencia, las organizaciones y naciones tendrán que mantener y desarrollar una perspectiva ecológica que conecte sus retos propios de la transformación digital con el desafío de mitigar sus aportes a la emisión de gases de efecto invernadero (Soler, 2019).</w:t>
       </w:r>
     </w:p>
     <w:p>
@@ -1503,7 +1503,13 @@
         <w:jc w:val="both"/>
       </w:pPr>
       <w:r>
-        <w:t xml:space="preserve">Impacto: El uso intensivo de procesamiento de información por las organizaciones y el aumento de participación de terceros con infraestructura en la nube (McKinsey &amp; Company, 2021) incrementan el uso de energía, cuya disipación aumenta los gases de efecto invernadero. En particular las empresas </w:t>
+        <w:t xml:space="preserve">Impacto: El uso intensivo de procesamiento de información por las organizaciones y el aumento de participación de terceros con infraestructura en la nube (McKinsey </w:t>
+      </w:r>
+      <w:r>
+        <w:t>y</w:t>
+      </w:r>
+      <w:r>
+        <w:t xml:space="preserve"> Company, 2021) incrementan el uso de energía, cuya disipación aumenta los gases de efecto invernadero. En particular las empresas </w:t>
       </w:r>
       <w:proofErr w:type="spellStart"/>
       <w:r>
@@ -1515,7 +1521,13 @@
       </w:r>
       <w:r>
         <w:lastRenderedPageBreak/>
-        <w:t>influencia a nivel global, ya que generan porcentajes de CO</w:t>
+        <w:t>influencia a nivel global</w:t>
+      </w:r>
+      <w:r>
+        <w:t xml:space="preserve"> y</w:t>
+      </w:r>
+      <w:r>
+        <w:t>a que generan porcentajes de CO</w:t>
       </w:r>
       <w:r>
         <w:rPr>
@@ -1772,7 +1784,13 @@
         <w:t>responsabilidad digital empresarial</w:t>
       </w:r>
       <w:r>
-        <w:t xml:space="preserve"> como el nuevo sello que reconoce los esfuerzos corporativos por encontrar un balance en medio de las tensiones y exigencias que se tienen en el tratamiento de datos de las personas (Cano &amp; Marroquín, 2021).</w:t>
+        <w:t xml:space="preserve"> como el nuevo sello que reconoce los esfuerzos corporativos por encontrar un balance en medio de las tensiones y exigencias que se tienen en el tratamiento de datos de las personas (Cano </w:t>
+      </w:r>
+      <w:r>
+        <w:t>y</w:t>
+      </w:r>
+      <w:r>
+        <w:t xml:space="preserve"> Marroquín, 2021).</w:t>
       </w:r>
     </w:p>
     <w:p>
@@ -1897,7 +1915,19 @@
       </w:r>
       <w:proofErr w:type="spellEnd"/>
       <w:r>
-        <w:t xml:space="preserve"> &amp; Pahi, 2020). Es necesario reconocer al menos los movimientos naturales de los adversarios, como la inteligencia, las técnicas de engaño, la identificación de pivotes (puntos de ingreso) y el despliegue de acciones maliciosas, con el fin de concretar la brecha o inestabilidad prevista, y trabajar desde allí, para avanzar en una estrategia no estandarizada, que haga más difíciles las acciones y propósitos de un posible agresor. Esto, en últimas, significa romper con la dinámica de lo conocido en pro de crear capacidades apropiadas para enfrentar la incertidumbre.</w:t>
+        <w:t xml:space="preserve"> </w:t>
+      </w:r>
+      <w:r>
+        <w:t>y</w:t>
+      </w:r>
+      <w:r>
+        <w:t xml:space="preserve"> Pahi, 2020). Es necesario reconocer al menos los movimientos naturales de los adversarios, como la inteligencia, las técnicas de engaño, la identificación de pivotes (puntos de ingreso) y el despliegue de acciones maliciosas, con el fin de concretar la brecha o inestabilidad prevista</w:t>
+      </w:r>
+      <w:r>
+        <w:t xml:space="preserve"> y</w:t>
+      </w:r>
+      <w:r>
+        <w:t xml:space="preserve"> trabajar desde allí, para avanzar en una estrategia no estandarizada, que haga más difíciles las acciones y propósitos de un posible agresor. Esto, en últimas, significa romper con la dinámica de lo conocido en pro de crear capacidades apropiadas para enfrentar la incertidumbre.</w:t>
       </w:r>
     </w:p>
     <w:p>
@@ -2000,17 +2030,29 @@
         <w:t>,</w:t>
       </w:r>
       <w:r>
-        <w:t xml:space="preserve"> entre otros, deben ser temas que marquen la agenda del plan de ciberseguridad nacional, como parte del equilibrio de garantías que los Estados deben brindar tanto para el uso de estos medios sociales de forma legítima como para los usos que resulten en deterioro de la convivencia y la estabilidad nacional (Singer &amp; Brooking, 2018).</w:t>
-      </w:r>
-    </w:p>
-    <w:p>
-      <w:pPr>
-        <w:spacing w:after="160" w:line="360" w:lineRule="auto"/>
-        <w:ind w:firstLine="720"/>
-        <w:jc w:val="both"/>
-      </w:pPr>
-      <w:r>
-        <w:t>A nivel tecnológico, es importante mantener un panorama actualizado de las tecnologías emergentes y disruptivas, con el fin de evaluar sus potencialidades y oportunidades para ofrecer mayores y mejores productos y servicios, así como revisar, analizar y simular sus posibles usos adversos. Esto permitirá reconocer nuevos patrones y amenazas que puedan comenzar a comprometer las condiciones defensivas, de modo que se pueda actuar de forma anticipada para atender incidentes que se puedan presentar. En la actualidad, omitir el seguimiento de los nuevos desarrollos de la inteligencia artificial y sus usos adversos representa una posición temeraria para cualquier Estado o empresa, dado que podrán ser fácilmente superados con las capacidades que se advierten a la fecha y en el futuro para estas tecnologías (Hoffman &amp; Levite, 2017; Dash et al., 2021).</w:t>
+        <w:t xml:space="preserve"> entre otros, deben ser temas que marquen la agenda del plan de ciberseguridad nacional, como parte del equilibrio de garantías que los Estados deben brindar tanto para el uso de estos medios sociales de forma legítima como para los usos que resulten en deterioro de la convivencia y la estabilidad nacional (Singer </w:t>
+      </w:r>
+      <w:r>
+        <w:t>y</w:t>
+      </w:r>
+      <w:r>
+        <w:t xml:space="preserve"> Brooking, 2018).</w:t>
+      </w:r>
+    </w:p>
+    <w:p>
+      <w:pPr>
+        <w:spacing w:after="160" w:line="360" w:lineRule="auto"/>
+        <w:ind w:firstLine="720"/>
+        <w:jc w:val="both"/>
+      </w:pPr>
+      <w:r>
+        <w:t xml:space="preserve">A nivel tecnológico, es importante mantener un panorama actualizado de las tecnologías emergentes y disruptivas, con el fin de evaluar sus potencialidades y oportunidades para ofrecer mayores y mejores productos y servicios, así como revisar, analizar y simular sus posibles usos adversos. Esto permitirá reconocer nuevos patrones y amenazas que puedan comenzar a comprometer las condiciones defensivas, de modo que se pueda actuar de forma anticipada para atender incidentes que se puedan presentar. En la actualidad, omitir el seguimiento de los nuevos desarrollos de la inteligencia artificial y sus usos adversos representa una posición temeraria para cualquier Estado o empresa, dado que podrán ser fácilmente superados con las capacidades que se advierten a la fecha y en el futuro para estas tecnologías (Hoffman </w:t>
+      </w:r>
+      <w:r>
+        <w:t>y</w:t>
+      </w:r>
+      <w:r>
+        <w:t xml:space="preserve"> Levite, 2017; Dash et al., 2021).</w:t>
       </w:r>
     </w:p>
     <w:p>
@@ -2082,7 +2124,27 @@
         </w:rPr>
       </w:pPr>
       <w:r>
-        <w:t xml:space="preserve">Ahmad, R., Yunos, Z., Sahib, S., &amp; Yusoff, M. (2012). </w:t>
+        <w:t>Ahmad, R.</w:t>
+      </w:r>
+      <w:r>
+        <w:t xml:space="preserve"> </w:t>
+      </w:r>
+      <w:proofErr w:type="spellStart"/>
+      <w:r>
+        <w:t>y</w:t>
+      </w:r>
+      <w:r>
+        <w:t>unos</w:t>
+      </w:r>
+      <w:proofErr w:type="spellEnd"/>
+      <w:r>
+        <w:t>, Z., Sahib, S.</w:t>
+      </w:r>
+      <w:r>
+        <w:t xml:space="preserve"> y</w:t>
+      </w:r>
+      <w:r>
+        <w:t xml:space="preserve"> Yusoff, M. (2012). </w:t>
       </w:r>
       <w:r>
         <w:rPr>
@@ -2136,7 +2198,13 @@
         </w:rPr>
       </w:pPr>
       <w:r>
-        <w:t xml:space="preserve">Boney, B., Hayslip, G., &amp; Stamper, M. (2018). </w:t>
+        <w:t>Boney, B., Hayslip, G.</w:t>
+      </w:r>
+      <w:r>
+        <w:t xml:space="preserve"> y</w:t>
+      </w:r>
+      <w:r>
+        <w:t xml:space="preserve"> Stamper, M. (2018). </w:t>
       </w:r>
       <w:r>
         <w:rPr>
@@ -2258,7 +2326,13 @@
         <w:jc w:val="both"/>
       </w:pPr>
       <w:r>
-        <w:t xml:space="preserve">Cano, J., &amp; Marroquín, J. (2021). Responsabilidad digital corporativa: una revisión sistemática. </w:t>
+        <w:t>Cano, J.</w:t>
+      </w:r>
+      <w:r>
+        <w:t xml:space="preserve"> y</w:t>
+      </w:r>
+      <w:r>
+        <w:t xml:space="preserve"> Marroquín, J. (2021). Responsabilidad digital corporativa: una revisión sistemática. </w:t>
       </w:r>
       <w:r>
         <w:rPr>
@@ -2397,11 +2471,36 @@
         </w:rPr>
       </w:pPr>
       <w:r>
-        <w:rPr>
-          <w:lang w:val="en-US"/>
-        </w:rPr>
         <w:lastRenderedPageBreak/>
-        <w:t xml:space="preserve">Dash, P., Karimibiuki, M., &amp; Pattabiraman, K. (2021). Stealthy attacks against robotic vehicles protected by control-based intrusion detection techniques. </w:t>
+        <w:t xml:space="preserve">Dash, P., </w:t>
+      </w:r>
+      <w:proofErr w:type="spellStart"/>
+      <w:r>
+        <w:t>Karimibiuki</w:t>
+      </w:r>
+      <w:proofErr w:type="spellEnd"/>
+      <w:r>
+        <w:t>, M.</w:t>
+      </w:r>
+      <w:r>
+        <w:t xml:space="preserve"> y</w:t>
+      </w:r>
+      <w:r>
+        <w:t xml:space="preserve"> </w:t>
+      </w:r>
+      <w:proofErr w:type="spellStart"/>
+      <w:r>
+        <w:t>Pattabiraman</w:t>
+      </w:r>
+      <w:proofErr w:type="spellEnd"/>
+      <w:r>
+        <w:t xml:space="preserve">, K. (2021). </w:t>
+      </w:r>
+      <w:r>
+        <w:rPr>
+          <w:lang w:val="en-US"/>
+        </w:rPr>
+        <w:t xml:space="preserve">Stealthy attacks against robotic vehicles protected by control-based intrusion detection techniques. </w:t>
       </w:r>
       <w:r>
         <w:rPr>
@@ -2488,7 +2587,19 @@
         <w:rPr>
           <w:lang w:val="en-US"/>
         </w:rPr>
-        <w:t xml:space="preserve">Donaldson, S., Siegel, S., Williams, C., &amp; Aslam, A. (2015). </w:t>
+        <w:t>Donaldson, S., Siegel, S., Williams, C.</w:t>
+      </w:r>
+      <w:r>
+        <w:rPr>
+          <w:lang w:val="en-US"/>
+        </w:rPr>
+        <w:t xml:space="preserve"> y</w:t>
+      </w:r>
+      <w:r>
+        <w:rPr>
+          <w:lang w:val="en-US"/>
+        </w:rPr>
+        <w:t xml:space="preserve"> Aslam, A. (2015). </w:t>
       </w:r>
       <w:r>
         <w:rPr>
@@ -2551,7 +2662,13 @@
       </w:r>
       <w:proofErr w:type="spellEnd"/>
       <w:r>
-        <w:t xml:space="preserve">, V., &amp; </w:t>
+        <w:t>, V.</w:t>
+      </w:r>
+      <w:r>
+        <w:t xml:space="preserve"> y</w:t>
+      </w:r>
+      <w:r>
+        <w:t xml:space="preserve"> </w:t>
       </w:r>
       <w:proofErr w:type="spellStart"/>
       <w:r>
@@ -2607,7 +2724,13 @@
         </w:rPr>
       </w:pPr>
       <w:r>
-        <w:t xml:space="preserve">Fergnani, A., Hines, A., Lanteri, A., &amp; Esposito, M. (2020, 25 de septiembre). </w:t>
+        <w:t>Fergnani, A., Hines, A., Lanteri, A.</w:t>
+      </w:r>
+      <w:r>
+        <w:t xml:space="preserve"> y</w:t>
+      </w:r>
+      <w:r>
+        <w:t xml:space="preserve"> Esposito, M. (2020, 25 de septiembre). </w:t>
       </w:r>
       <w:r>
         <w:rPr>
@@ -2639,10 +2762,27 @@
         </w:rPr>
       </w:pPr>
       <w:r>
-        <w:rPr>
-          <w:lang w:val="en-US"/>
-        </w:rPr>
-        <w:t xml:space="preserve">Ganghi, R., Sharma, A., Mahoney, W., Sousan, W., Zhu, Q., &amp; Laplante, P. (2011). Dimension of cyber-attacks. Social, political, economic, and cultural. </w:t>
+        <w:t xml:space="preserve">Ganghi, R., Sharma, A., Mahoney, W., </w:t>
+      </w:r>
+      <w:proofErr w:type="spellStart"/>
+      <w:r>
+        <w:t>Sousan</w:t>
+      </w:r>
+      <w:proofErr w:type="spellEnd"/>
+      <w:r>
+        <w:t>, W., Zhu, Q.</w:t>
+      </w:r>
+      <w:r>
+        <w:t xml:space="preserve"> y</w:t>
+      </w:r>
+      <w:r>
+        <w:t xml:space="preserve"> Laplante, P. (2011). </w:t>
+      </w:r>
+      <w:r>
+        <w:rPr>
+          <w:lang w:val="en-US"/>
+        </w:rPr>
+        <w:t xml:space="preserve">Dimension of cyber-attacks. Social, political, economic, and cultural. </w:t>
       </w:r>
       <w:r>
         <w:rPr>
@@ -2671,7 +2811,19 @@
         <w:rPr>
           <w:lang w:val="en-US"/>
         </w:rPr>
-        <w:t xml:space="preserve">Hepfer, M., &amp; Powell, T. (2020). Make cybersecurity a strategic asset. </w:t>
+        <w:t>Hepfer, M.</w:t>
+      </w:r>
+      <w:r>
+        <w:rPr>
+          <w:lang w:val="en-US"/>
+        </w:rPr>
+        <w:t xml:space="preserve"> y</w:t>
+      </w:r>
+      <w:r>
+        <w:rPr>
+          <w:lang w:val="en-US"/>
+        </w:rPr>
+        <w:t xml:space="preserve"> Powell, T. (2020). Make cybersecurity a strategic asset. </w:t>
       </w:r>
       <w:r>
         <w:rPr>
@@ -2700,7 +2852,19 @@
         <w:rPr>
           <w:lang w:val="en-US"/>
         </w:rPr>
-        <w:t xml:space="preserve">Hines, A., &amp; Bishop, P. (2015). </w:t>
+        <w:t>Hines, A.</w:t>
+      </w:r>
+      <w:r>
+        <w:rPr>
+          <w:lang w:val="en-US"/>
+        </w:rPr>
+        <w:t xml:space="preserve"> y</w:t>
+      </w:r>
+      <w:r>
+        <w:rPr>
+          <w:lang w:val="en-US"/>
+        </w:rPr>
+        <w:t xml:space="preserve"> Bishop, P. (2015). </w:t>
       </w:r>
       <w:r>
         <w:rPr>
@@ -2726,10 +2890,13 @@
         </w:rPr>
       </w:pPr>
       <w:r>
-        <w:rPr>
-          <w:lang w:val="en-US"/>
-        </w:rPr>
-        <w:t xml:space="preserve">Hoffman, W., &amp; Levite, A. (2017). </w:t>
+        <w:t>Hoffman, W.</w:t>
+      </w:r>
+      <w:r>
+        <w:t xml:space="preserve"> y</w:t>
+      </w:r>
+      <w:r>
+        <w:t xml:space="preserve"> Levite, A. (2017). </w:t>
       </w:r>
       <w:r>
         <w:rPr>
@@ -2814,9 +2981,6 @@
         <w:spacing w:after="160" w:line="360" w:lineRule="auto"/>
         <w:ind w:left="720" w:hanging="720"/>
         <w:jc w:val="both"/>
-        <w:rPr>
-          <w:lang w:val="en-US"/>
-        </w:rPr>
       </w:pPr>
       <w:r>
         <w:t xml:space="preserve">Jordán, J. (2021). </w:t>
@@ -2847,10 +3011,25 @@
         <w:t xml:space="preserve"> 28). </w:t>
       </w:r>
       <w:r>
-        <w:rPr>
-          <w:lang w:val="en-US"/>
-        </w:rPr>
-        <w:t>Global Strategy. https://bit.ly/3L9sjqK</w:t>
+        <w:t xml:space="preserve">Global </w:t>
+      </w:r>
+      <w:proofErr w:type="spellStart"/>
+      <w:r>
+        <w:t>Strategy</w:t>
+      </w:r>
+      <w:proofErr w:type="spellEnd"/>
+      <w:r>
+        <w:t>. https://bit.ly/3L9sjqK</w:t>
+      </w:r>
+    </w:p>
+    <w:p>
+      <w:pPr>
+        <w:spacing w:after="160" w:line="360" w:lineRule="auto"/>
+        <w:ind w:left="720" w:hanging="720"/>
+        <w:jc w:val="both"/>
+      </w:pPr>
+      <w:r>
+        <w:t>Lastra, X. (2007). [Título pendiente].</w:t>
       </w:r>
     </w:p>
     <w:p>
@@ -2924,7 +3103,19 @@
         <w:rPr>
           <w:lang w:val="en-US"/>
         </w:rPr>
-        <w:t xml:space="preserve">McKinsey &amp; Company. (2021). </w:t>
+        <w:t xml:space="preserve">McKinsey </w:t>
+      </w:r>
+      <w:r>
+        <w:rPr>
+          <w:lang w:val="en-US"/>
+        </w:rPr>
+        <w:t>y</w:t>
+      </w:r>
+      <w:r>
+        <w:rPr>
+          <w:lang w:val="en-US"/>
+        </w:rPr>
+        <w:t xml:space="preserve"> Company. (2021). </w:t>
       </w:r>
       <w:r>
         <w:rPr>
@@ -3128,7 +3319,37 @@
         <w:rPr>
           <w:lang w:val="en-US"/>
         </w:rPr>
-        <w:t xml:space="preserve">Raban, Y. &amp; Hauptman, A. (2018). Foresight of cyber security threat drivers and affecting technologies. </w:t>
+        <w:t>Raban</w:t>
+      </w:r>
+      <w:r>
+        <w:rPr>
+          <w:lang w:val="en-US"/>
+        </w:rPr>
+        <w:t xml:space="preserve"> y</w:t>
+      </w:r>
+      <w:r>
+        <w:rPr>
+          <w:lang w:val="en-US"/>
+        </w:rPr>
+        <w:t xml:space="preserve">. </w:t>
+      </w:r>
+      <w:r>
+        <w:rPr>
+          <w:lang w:val="en-US"/>
+        </w:rPr>
+        <w:t>y</w:t>
+      </w:r>
+      <w:r>
+        <w:rPr>
+          <w:lang w:val="en-US"/>
+        </w:rPr>
+        <w:t xml:space="preserve"> Hauptman, A. (2018). </w:t>
+      </w:r>
+      <w:r>
+        <w:rPr>
+          <w:lang w:val="en-US"/>
+        </w:rPr>
+        <w:t xml:space="preserve">Foresight of cyber security threat drivers and affecting technologies. </w:t>
       </w:r>
       <w:proofErr w:type="spellStart"/>
       <w:r>
@@ -3257,11 +3478,28 @@
           <w:lang w:val="en-US"/>
         </w:rPr>
       </w:pPr>
-      <w:r>
-        <w:rPr>
-          <w:lang w:val="en-US"/>
-        </w:rPr>
-        <w:t xml:space="preserve">Shiroishi, Y., Uchiyama, K., &amp; Suzuki, N. (2018). Society 5.0: for human security and well-being. </w:t>
+      <w:proofErr w:type="spellStart"/>
+      <w:r>
+        <w:t>Shiroishi</w:t>
+      </w:r>
+      <w:proofErr w:type="spellEnd"/>
+      <w:r>
+        <w:t xml:space="preserve"> y</w:t>
+      </w:r>
+      <w:r>
+        <w:t>., Uchiyama, K.</w:t>
+      </w:r>
+      <w:r>
+        <w:t xml:space="preserve"> y</w:t>
+      </w:r>
+      <w:r>
+        <w:t xml:space="preserve"> Suzuki, N. (2018). </w:t>
+      </w:r>
+      <w:r>
+        <w:rPr>
+          <w:lang w:val="en-US"/>
+        </w:rPr>
+        <w:t xml:space="preserve">Society 5.0: for human security and well-being. </w:t>
       </w:r>
       <w:r>
         <w:rPr>
@@ -3290,7 +3528,19 @@
         <w:rPr>
           <w:lang w:val="en-US"/>
         </w:rPr>
-        <w:t xml:space="preserve">Singer, P. W., &amp; Brooking, E. (2018). </w:t>
+        <w:t>Singer, P. W.</w:t>
+      </w:r>
+      <w:r>
+        <w:rPr>
+          <w:lang w:val="en-US"/>
+        </w:rPr>
+        <w:t xml:space="preserve"> y</w:t>
+      </w:r>
+      <w:r>
+        <w:rPr>
+          <w:lang w:val="en-US"/>
+        </w:rPr>
+        <w:t xml:space="preserve"> Brooking, E. (2018). </w:t>
       </w:r>
       <w:r>
         <w:rPr>
@@ -3316,7 +3566,25 @@
         <w:rPr>
           <w:lang w:val="en-US"/>
         </w:rPr>
-        <w:t xml:space="preserve">Skopik, F., &amp; Pahi, T. (2020). Under false flag: using technical artifacts for cyber attack attribution. </w:t>
+        <w:t>Skopik, F.</w:t>
+      </w:r>
+      <w:r>
+        <w:rPr>
+          <w:lang w:val="en-US"/>
+        </w:rPr>
+        <w:t xml:space="preserve"> y</w:t>
+      </w:r>
+      <w:r>
+        <w:rPr>
+          <w:lang w:val="en-US"/>
+        </w:rPr>
+        <w:t xml:space="preserve"> Pahi, T. (2020). </w:t>
+      </w:r>
+      <w:r>
+        <w:rPr>
+          <w:lang w:val="en-US"/>
+        </w:rPr>
+        <w:t xml:space="preserve">Under false flag: using technical artifacts for cyber attack attribution. </w:t>
       </w:r>
       <w:proofErr w:type="spellStart"/>
       <w:r>
@@ -3439,7 +3707,25 @@
         <w:rPr>
           <w:lang w:val="en-US"/>
         </w:rPr>
-        <w:t xml:space="preserve">Wolfowitz, P., Rivera, K., &amp; Ware, G. (2018, 9 de octubre). Planning for the unexpected. </w:t>
+        <w:t>Wolfowitz, P., Rivera, K.</w:t>
+      </w:r>
+      <w:r>
+        <w:rPr>
+          <w:lang w:val="en-US"/>
+        </w:rPr>
+        <w:t xml:space="preserve"> y</w:t>
+      </w:r>
+      <w:r>
+        <w:rPr>
+          <w:lang w:val="en-US"/>
+        </w:rPr>
+        <w:t xml:space="preserve"> Ware, G. (2018, 9 de octubre). </w:t>
+      </w:r>
+      <w:r>
+        <w:rPr>
+          <w:lang w:val="en-US"/>
+        </w:rPr>
+        <w:t xml:space="preserve">Planning for the unexpected. </w:t>
       </w:r>
       <w:r>
         <w:rPr>
@@ -3497,7 +3783,19 @@
         <w:rPr>
           <w:lang w:val="en-US"/>
         </w:rPr>
-        <w:t xml:space="preserve">Xiao, C., Li, B., Zhu, J., He, W., Liu, M., &amp; Song, D. (2018). Generating adversarial examples with adversarial networks. En </w:t>
+        <w:t>Xiao, C., Li, B., Zhu, J., He, W., Liu, M.</w:t>
+      </w:r>
+      <w:r>
+        <w:rPr>
+          <w:lang w:val="en-US"/>
+        </w:rPr>
+        <w:t xml:space="preserve"> y</w:t>
+      </w:r>
+      <w:r>
+        <w:rPr>
+          <w:lang w:val="en-US"/>
+        </w:rPr>
+        <w:t xml:space="preserve"> Song, D. (2018). Generating adversarial examples with adversarial networks. En </w:t>
       </w:r>
       <w:r>
         <w:rPr>
@@ -3523,7 +3821,19 @@
         <w:rPr>
           <w:lang w:val="en-US"/>
         </w:rPr>
-        <w:t xml:space="preserve">Yannakogeorgos, P. (2014). Rethinking the threat of cyberterrorism. En T. Chen, L. Jarvis, &amp; S. Macdonald (Eds.), </w:t>
+        <w:t>Yannakogeorgos, P. (2014). Rethinking the threat of cyberterrorism. En T. Chen, L. Jarvis</w:t>
+      </w:r>
+      <w:r>
+        <w:rPr>
+          <w:lang w:val="en-US"/>
+        </w:rPr>
+        <w:t xml:space="preserve"> y</w:t>
+      </w:r>
+      <w:r>
+        <w:rPr>
+          <w:lang w:val="en-US"/>
+        </w:rPr>
+        <w:t xml:space="preserve"> S. Macdonald (Eds.), </w:t>
       </w:r>
       <w:r>
         <w:rPr>

</xml_diff>